<commit_message>
Fill in author details in title page, cover letter and manuscript
Co-Authored-By: Claude Sonnet 5.5 <noreply@anthropic.com>
Claude-Session: https://claude.ai/code/session_017hWnWPusfqT6TBN6LzLVu5
</commit_message>
<xml_diff>
--- a/paper/cover_letter.docx
+++ b/paper/cover_letter.docx
@@ -126,7 +126,7 @@
         <w:pStyle w:val="BodyText"/>
       </w:pPr>
       <w:r>
-        <w:t xml:space="preserve">To the best of our knowledge, the manuscript is original, has not been published previously and is not under consideration for publication elsewhere. All authors have read and approved the submitted version and agree to its submission to</w:t>
+        <w:t xml:space="preserve">To the best of our knowledge, the manuscript is original, has not been published previously and is not under consideration for publication elsewhere. I have read and approved the submitted version and agree to its submission to</w:t>
       </w:r>
       <w:r>
         <w:t xml:space="preserve"> </w:t>
@@ -139,7 +139,7 @@
         <w:t xml:space="preserve">Decision Support Systems</w:t>
       </w:r>
       <w:r>
-        <w:t xml:space="preserve">. The authors declare no competing interests [to be confirmed]. As required, the manuscript includes a declaration of the use of generative AI tools in its preparation. The traces are public, and our code and result tables are available at [repository URL].</w:t>
+        <w:t xml:space="preserve">. I declare no competing interests [to be confirmed]. As required, the manuscript includes a declaration of the use of generative AI tools in its preparation. The traces are public, and our code and result tables are available at [repository URL].</w:t>
       </w:r>
     </w:p>
     <w:p>
@@ -147,7 +147,7 @@
         <w:pStyle w:val="BodyText"/>
       </w:pPr>
       <w:r>
-        <w:t xml:space="preserve">[Optional: We suggest the following reviewers, who have no conflict of interest with the authors: (1) [Name, affiliation, e-mail]; (2) [Name, affiliation, e-mail]; (3) [Name, affiliation, e-mail]. We ask that [Name] not be asked to review because of [reason].]</w:t>
+        <w:t xml:space="preserve">[Optional: We suggest the following reviewers, who have no conflict of interest with me: (1) [Name, affiliation, e-mail]; (2) [Name, affiliation, e-mail]; (3) [Name, affiliation, e-mail]. We ask that [Name] not be asked to review because of [reason].]</w:t>
       </w:r>
     </w:p>
     <w:p>
@@ -171,25 +171,19 @@
         <w:pStyle w:val="BodyText"/>
       </w:pPr>
       <w:r>
-        <w:t xml:space="preserve">[Corresponding author’s name]</w:t>
+        <w:t xml:space="preserve">Ook Lee</w:t>
       </w:r>
       <w:r>
         <w:t xml:space="preserve"> </w:t>
       </w:r>
       <w:r>
-        <w:t xml:space="preserve">[Title and affiliation]</w:t>
+        <w:t xml:space="preserve">Department of Information Systems, Hanyang University, Seoul, Republic of Korea</w:t>
       </w:r>
       <w:r>
         <w:t xml:space="preserve"> </w:t>
       </w:r>
       <w:r>
-        <w:t xml:space="preserve">[E-mail] · [Telephone]</w:t>
-      </w:r>
-      <w:r>
-        <w:t xml:space="preserve"> </w:t>
-      </w:r>
-      <w:r>
-        <w:t xml:space="preserve">on behalf of all authors</w:t>
+        <w:t xml:space="preserve">ooklee@hanyang.ac.kr</w:t>
       </w:r>
     </w:p>
     <w:sectPr/>

</xml_diff>